<commit_message>
Push enhancements to the components
</commit_message>
<xml_diff>
--- a/TECHNICAL_DESIGN.docx
+++ b/TECHNICAL_DESIGN.docx
@@ -15,7 +15,7 @@
         <w:pStyle w:val="Subtitle"/>
       </w:pPr>
       <w:r>
-        <w:t xml:space="preserve">Technical Design Document - v2.4.0</w:t>
+        <w:t xml:space="preserve">Technical Design Document - v2.6.0</w:t>
       </w:r>
     </w:p>
     <w:p>
@@ -121,7 +121,7 @@
               <w:pStyle w:val="Compact"/>
             </w:pPr>
             <w:r>
-              <w:t xml:space="preserve">2.4.0</w:t>
+              <w:t xml:space="preserve">2.6.0</w:t>
             </w:r>
           </w:p>
         </w:tc>
@@ -10396,6 +10396,88 @@
             </w:pPr>
             <w:r>
               <w:t xml:space="preserve">Summary</w:t>
+            </w:r>
+          </w:p>
+        </w:tc>
+      </w:tr>
+      <w:tr>
+        <w:tc>
+          <w:tcPr/>
+          <w:p>
+            <w:pPr>
+              <w:pStyle w:val="Compact"/>
+            </w:pPr>
+            <w:r>
+              <w:t xml:space="preserve">2.6.0</w:t>
+            </w:r>
+          </w:p>
+        </w:tc>
+        <w:tc>
+          <w:tcPr/>
+          <w:p>
+            <w:pPr>
+              <w:pStyle w:val="Compact"/>
+            </w:pPr>
+            <w:r>
+              <w:t xml:space="preserve">2026-03-29</w:t>
+            </w:r>
+          </w:p>
+        </w:tc>
+        <w:tc>
+          <w:tcPr/>
+          <w:p>
+            <w:pPr>
+              <w:pStyle w:val="Compact"/>
+            </w:pPr>
+            <w:r>
+              <w:t xml:space="preserve">Tasks stability pass: overdue TaskCards get red left-border accent +</w:t>
+            </w:r>
+            <w:r>
+              <w:t xml:space="preserve"> </w:t>
+            </w:r>
+            <w:r>
+              <w:t xml:space="preserve">“X days ago”</w:t>
+            </w:r>
+            <w:r>
+              <w:t xml:space="preserve"> </w:t>
+            </w:r>
+            <w:r>
+              <w:t xml:space="preserve">label; HelperTaskList contextual empty states per tab (today/week/month); late pending tasks in helper view flagged with ⚠️ date header; schedule tab empty-today state with template prompt.</w:t>
+            </w:r>
+          </w:p>
+        </w:tc>
+      </w:tr>
+      <w:tr>
+        <w:tc>
+          <w:tcPr/>
+          <w:p>
+            <w:pPr>
+              <w:pStyle w:val="Compact"/>
+            </w:pPr>
+            <w:r>
+              <w:t xml:space="preserve">2.5.0</w:t>
+            </w:r>
+          </w:p>
+        </w:tc>
+        <w:tc>
+          <w:tcPr/>
+          <w:p>
+            <w:pPr>
+              <w:pStyle w:val="Compact"/>
+            </w:pPr>
+            <w:r>
+              <w:t xml:space="preserve">2026-03-29</w:t>
+            </w:r>
+          </w:p>
+        </w:tc>
+        <w:tc>
+          <w:tcPr/>
+          <w:p>
+            <w:pPr>
+              <w:pStyle w:val="Compact"/>
+            </w:pPr>
+            <w:r>
+              <w:t xml:space="preserve">Recurrence feature end-to-end: recurType picker in CreateTask/CreateTemplate sheets, 🔁 badge on TaskCard and template cards, auto-assign recurring templates on admin load via useEffect guard, useTasks persists recur_type to DB. Filipino household + baby care task templates seeded.</w:t>
             </w:r>
           </w:p>
         </w:tc>

</xml_diff>